<commit_message>
Atualiza pacote SEI e justifica textos da previa
</commit_message>
<xml_diff>
--- a/Documentação/apontamentos_divergencias_notas_tecnicas_dcom.docx
+++ b/Documentação/apontamentos_divergencias_notas_tecnicas_dcom.docx
@@ -16,7 +16,7 @@
         <w:pStyle w:val="FirstParagraph"/>
       </w:pPr>
       <w:r>
-        <w:t xml:space="preserve">Data: 2026-05-12</w:t>
+        <w:t xml:space="preserve">Data: 2026-05-13</w:t>
       </w:r>
     </w:p>
     <w:bookmarkStart w:id="9" w:name="finalidade"/>
@@ -211,7 +211,7 @@
         </w:numPr>
       </w:pPr>
       <w:r>
-        <w:t xml:space="preserve">O texto da Revista Brasileira de Execução Penal perdeu as menções institucionais à Espen, à DCOM e à Onasp.</w:t>
+        <w:t xml:space="preserve">O texto da Revista Brasileira de Execução Penal publicado diverge da redação institucional hoje consolidada para a subpágina temática.</w:t>
       </w:r>
     </w:p>
     <w:p>
@@ -491,29 +491,38 @@
               <w:pStyle w:val="Compact"/>
             </w:pPr>
             <w:r>
-              <w:t xml:space="preserve">Texto com menção a Espen, DCOM e Onasp.</w:t>
-            </w:r>
-          </w:p>
-        </w:tc>
-        <w:tc>
-          <w:tcPr/>
-          <w:p>
-            <w:pPr>
-              <w:pStyle w:val="Compact"/>
-            </w:pPr>
-            <w:r>
-              <w:t xml:space="preserve">Texto publicado omitiu essas menções.</w:t>
-            </w:r>
-          </w:p>
-        </w:tc>
-        <w:tc>
-          <w:tcPr/>
-          <w:p>
-            <w:pPr>
-              <w:pStyle w:val="Compact"/>
-            </w:pPr>
-            <w:r>
-              <w:t xml:space="preserve">Restaurar a redação institucional solicitada.</w:t>
+              <w:t xml:space="preserve">Texto com articulação institucional entre Espen, DCOM e Onasp.</w:t>
+            </w:r>
+          </w:p>
+        </w:tc>
+        <w:tc>
+          <w:tcPr/>
+          <w:p>
+            <w:pPr>
+              <w:pStyle w:val="Compact"/>
+            </w:pPr>
+            <w:r>
+              <w:t xml:space="preserve">Texto publicado suprimiu essa articulação e não acompanha a redação hoje consolidada para a subpágina.</w:t>
+            </w:r>
+          </w:p>
+        </w:tc>
+        <w:tc>
+          <w:tcPr/>
+          <w:p>
+            <w:pPr>
+              <w:pStyle w:val="Compact"/>
+            </w:pPr>
+            <w:r>
+              <w:t xml:space="preserve">Adequar para:</w:t>
+            </w:r>
+            <w:r>
+              <w:t xml:space="preserve"> </w:t>
+            </w:r>
+            <w:r>
+              <w:rPr>
+                <w:rStyle w:val="VerbatimChar"/>
+              </w:rPr>
+              <w:t xml:space="preserve">Em articulação com a Espen e a DCOM, esta subpágina reúne referências da Revista Brasileira de Execução Penal.</w:t>
             </w:r>
           </w:p>
         </w:tc>
@@ -1391,7 +1400,16 @@
         </w:numPr>
       </w:pPr>
       <w:r>
-        <w:t xml:space="preserve">Restaurar o texto da Revista Brasileira de Execução Penal com menção à Espen, à DCOM e à Onasp.</w:t>
+        <w:t xml:space="preserve">Adequar o texto da Revista Brasileira de Execução Penal à redação institucional consolidada da subpágina:</w:t>
+      </w:r>
+      <w:r>
+        <w:t xml:space="preserve"> </w:t>
+      </w:r>
+      <w:r>
+        <w:rPr>
+          <w:rStyle w:val="VerbatimChar"/>
+        </w:rPr>
+        <w:t xml:space="preserve">Em articulação com a Espen e a DCOM, esta subpágina reúne referências da Revista Brasileira de Execução Penal.</w:t>
       </w:r>
     </w:p>
     <w:p>

</xml_diff>